<commit_message>
further edits to the Contract
</commit_message>
<xml_diff>
--- a/srDesign_Contract.docx
+++ b/srDesign_Contract.docx
@@ -215,25 +215,6 @@
           <w:szCs w:val="12"/>
         </w:rPr>
       </w:pPr>
-      <w:r>
-        <w:rPr>
-          <w:rFonts w:ascii="CMSS8" w:hAnsi="CMSS8" w:cs="CMSS8"/>
-          <w:color w:val="FFFFFF"/>
-          <w:sz w:val="12"/>
-          <w:szCs w:val="12"/>
-        </w:rPr>
-        <w:t>Senior Design Boot Camp 17</w:t>
-      </w:r>
-    </w:p>
-    <w:p>
-      <w:pPr>
-        <w:rPr>
-          <w:rFonts w:ascii="CMSS8" w:hAnsi="CMSS8" w:cs="CMSS8"/>
-          <w:color w:val="FFFFFF"/>
-          <w:sz w:val="12"/>
-          <w:szCs w:val="12"/>
-        </w:rPr>
-      </w:pPr>
     </w:p>
     <w:p>
       <w:pPr>
@@ -292,7 +273,6 @@
           <w:color w:val="000000"/>
           <w:sz w:val="27"/>
           <w:szCs w:val="27"/>
-          <w:u w:val="single"/>
         </w:rPr>
         <w:t>MDK</w:t>
       </w:r>
@@ -311,89 +291,44 @@
           <w:color w:val="000000"/>
           <w:sz w:val="27"/>
           <w:szCs w:val="27"/>
-          <w:u w:val="single"/>
-        </w:rPr>
-        <w:t xml:space="preserve">Marshall </w:t>
-      </w:r>
-      <w:proofErr w:type="spellStart"/>
-      <w:r>
-        <w:rPr>
-          <w:rFonts w:ascii="Times New Roman" w:eastAsia="Times New Roman" w:hAnsi="Times New Roman" w:cs="Times New Roman"/>
-          <w:color w:val="000000"/>
-          <w:sz w:val="27"/>
-          <w:szCs w:val="27"/>
-          <w:u w:val="single"/>
-        </w:rPr>
-        <w:t>Ga</w:t>
-      </w:r>
-      <w:r>
-        <w:rPr>
-          <w:rFonts w:ascii="Times New Roman" w:eastAsia="Times New Roman" w:hAnsi="Times New Roman" w:cs="Times New Roman"/>
-          <w:color w:val="000000"/>
-          <w:sz w:val="27"/>
-          <w:szCs w:val="27"/>
-          <w:u w:val="single"/>
-        </w:rPr>
-        <w:t>ucher</w:t>
-      </w:r>
-      <w:proofErr w:type="spellEnd"/>
-      <w:r>
-        <w:rPr>
-          <w:rFonts w:ascii="Times New Roman" w:eastAsia="Times New Roman" w:hAnsi="Times New Roman" w:cs="Times New Roman"/>
-          <w:color w:val="000000"/>
-          <w:sz w:val="27"/>
-          <w:szCs w:val="27"/>
-          <w:u w:val="single"/>
-        </w:rPr>
-        <w:t>,</w:t>
-      </w:r>
-      <w:r>
-        <w:rPr>
-          <w:rFonts w:ascii="Times New Roman" w:eastAsia="Times New Roman" w:hAnsi="Times New Roman" w:cs="Times New Roman"/>
-          <w:color w:val="000000"/>
-          <w:sz w:val="27"/>
-          <w:szCs w:val="27"/>
-          <w:u w:val="single"/>
-        </w:rPr>
-        <w:t xml:space="preserve"> David Jarman, and Kevin Worner</w:t>
-      </w:r>
-      <w:r>
-        <w:rPr>
-          <w:rFonts w:ascii="Times New Roman" w:eastAsia="Times New Roman" w:hAnsi="Times New Roman" w:cs="Times New Roman"/>
-          <w:color w:val="000000"/>
-          <w:sz w:val="27"/>
-          <w:szCs w:val="27"/>
-          <w:u w:val="single"/>
-        </w:rPr>
-        <w:t xml:space="preserve"> </w:t>
-      </w:r>
-      <w:r>
-        <w:rPr>
-          <w:rFonts w:ascii="Times New Roman" w:eastAsia="Times New Roman" w:hAnsi="Times New Roman" w:cs="Times New Roman"/>
-          <w:color w:val="000000"/>
-          <w:sz w:val="27"/>
-          <w:szCs w:val="27"/>
-        </w:rPr>
-        <w:t xml:space="preserve">and </w:t>
-      </w:r>
-      <w:r>
-        <w:rPr>
-          <w:rFonts w:ascii="Times New Roman" w:eastAsia="Times New Roman" w:hAnsi="Times New Roman" w:cs="Times New Roman"/>
-          <w:color w:val="000000"/>
-          <w:sz w:val="27"/>
-          <w:szCs w:val="27"/>
-          <w:u w:val="single"/>
-        </w:rPr>
-        <w:t>Innovative Systems</w:t>
-      </w:r>
-      <w:r>
-        <w:rPr>
-          <w:rFonts w:ascii="Times New Roman" w:eastAsia="Times New Roman" w:hAnsi="Times New Roman" w:cs="Times New Roman"/>
-          <w:color w:val="000000"/>
-          <w:sz w:val="27"/>
-          <w:szCs w:val="27"/>
-        </w:rPr>
-        <w:t xml:space="preserve"> ("Sponsor"),</w:t>
+        </w:rPr>
+        <w:t>Marshall Ga</w:t>
+      </w:r>
+      <w:r>
+        <w:rPr>
+          <w:rFonts w:ascii="Times New Roman" w:eastAsia="Times New Roman" w:hAnsi="Times New Roman" w:cs="Times New Roman"/>
+          <w:color w:val="000000"/>
+          <w:sz w:val="27"/>
+          <w:szCs w:val="27"/>
+        </w:rPr>
+        <w:t>ucher, David Jarman, and Kevin Worner</w:t>
+      </w:r>
+      <w:r>
+        <w:rPr>
+          <w:rFonts w:ascii="Times New Roman" w:eastAsia="Times New Roman" w:hAnsi="Times New Roman" w:cs="Times New Roman"/>
+          <w:color w:val="000000"/>
+          <w:sz w:val="27"/>
+          <w:szCs w:val="27"/>
+        </w:rPr>
+        <w:t xml:space="preserve"> and Innovative Systems</w:t>
+      </w:r>
+      <w:r>
+        <w:rPr>
+          <w:rFonts w:ascii="Times New Roman" w:eastAsia="Times New Roman" w:hAnsi="Times New Roman" w:cs="Times New Roman"/>
+          <w:color w:val="000000"/>
+          <w:sz w:val="27"/>
+          <w:szCs w:val="27"/>
+        </w:rPr>
+        <w:t>, LLC</w:t>
+      </w:r>
+      <w:r>
+        <w:rPr>
+          <w:rFonts w:ascii="Times New Roman" w:eastAsia="Times New Roman" w:hAnsi="Times New Roman" w:cs="Times New Roman"/>
+          <w:color w:val="000000"/>
+          <w:sz w:val="27"/>
+          <w:szCs w:val="27"/>
+        </w:rPr>
+        <w:t>("Sponsor"),</w:t>
       </w:r>
       <w:r>
         <w:rPr>
@@ -410,27 +345,17 @@
           <w:color w:val="000000"/>
           <w:sz w:val="27"/>
           <w:szCs w:val="27"/>
-          <w:u w:val="single"/>
-        </w:rPr>
-        <w:t>Mitchell, SD</w:t>
-      </w:r>
-      <w:r>
-        <w:rPr>
-          <w:rFonts w:ascii="Times New Roman" w:eastAsia="Times New Roman" w:hAnsi="Times New Roman" w:cs="Times New Roman"/>
-          <w:color w:val="000000"/>
-          <w:sz w:val="27"/>
-          <w:szCs w:val="27"/>
-        </w:rPr>
-        <w:t>.</w:t>
-      </w:r>
-      <w:r>
-        <w:rPr>
-          <w:rFonts w:ascii="Times New Roman" w:eastAsia="Times New Roman" w:hAnsi="Times New Roman" w:cs="Times New Roman"/>
-          <w:color w:val="000000"/>
-          <w:sz w:val="27"/>
-          <w:szCs w:val="27"/>
-        </w:rPr>
-        <w:t> </w:t>
+        </w:rPr>
+        <w:t>Rapid City</w:t>
+      </w:r>
+      <w:r>
+        <w:rPr>
+          <w:rFonts w:ascii="Times New Roman" w:eastAsia="Times New Roman" w:hAnsi="Times New Roman" w:cs="Times New Roman"/>
+          <w:color w:val="000000"/>
+          <w:sz w:val="27"/>
+          <w:szCs w:val="27"/>
+        </w:rPr>
+        <w:t>, SD.</w:t>
       </w:r>
       <w:r>
         <w:rPr>
@@ -665,7 +590,16 @@
           <w:szCs w:val="27"/>
         </w:rPr>
         <w:br/>
-        <w:t xml:space="preserve">1. "Software" shall mean [the computer programs in machine readable object code form and any subsequent error corrections or updates supplied to Sponsor by Senior Design Team pursuant to this Agreement.] [Depending on the particulars of each agreement, any or all of the following may need to be specified. If they are relevant, </w:t>
+        <w:t>1. "Software" shall mean [the computer programs in machine readable object code form and any subsequent error corrections or updates supplied to Sponsor by Senior Design Team pursuant to this Agreement.] [Depending on the particulars of each agreement, any or all of the following may need to be specified. If they are relevant, they should be used throughout, modifying the standard form as appropriate.] </w:t>
+      </w:r>
+      <w:r>
+        <w:rPr>
+          <w:rFonts w:ascii="Times New Roman" w:eastAsia="Times New Roman" w:hAnsi="Times New Roman" w:cs="Times New Roman"/>
+          <w:color w:val="000000"/>
+          <w:sz w:val="27"/>
+          <w:szCs w:val="27"/>
+        </w:rPr>
+        <w:br/>
       </w:r>
       <w:r>
         <w:rPr>
@@ -675,45 +609,56 @@
           <w:szCs w:val="27"/>
         </w:rPr>
         <w:lastRenderedPageBreak/>
-        <w:t>they should be used throughout, modifying the standard form as appropriate.] </w:t>
-      </w:r>
-      <w:r>
-        <w:rPr>
-          <w:rFonts w:ascii="Times New Roman" w:eastAsia="Times New Roman" w:hAnsi="Times New Roman" w:cs="Times New Roman"/>
-          <w:color w:val="000000"/>
-          <w:sz w:val="27"/>
-          <w:szCs w:val="27"/>
-        </w:rPr>
-        <w:br/>
-      </w:r>
-      <w:r>
-        <w:rPr>
-          <w:rFonts w:ascii="Times New Roman" w:eastAsia="Times New Roman" w:hAnsi="Times New Roman" w:cs="Times New Roman"/>
-          <w:color w:val="000000"/>
-          <w:sz w:val="27"/>
-          <w:szCs w:val="27"/>
-        </w:rPr>
-        <w:br/>
-        <w:t>2. "Acceptance Criteria" means the written technical and operational performance and functional criteria and documentation standards set out in the [project plan.] </w:t>
-      </w:r>
-      <w:r>
-        <w:rPr>
-          <w:rFonts w:ascii="Times New Roman" w:eastAsia="Times New Roman" w:hAnsi="Times New Roman" w:cs="Times New Roman"/>
-          <w:color w:val="000000"/>
-          <w:sz w:val="27"/>
-          <w:szCs w:val="27"/>
-        </w:rPr>
-        <w:br/>
-      </w:r>
-      <w:r>
-        <w:rPr>
-          <w:rFonts w:ascii="Times New Roman" w:eastAsia="Times New Roman" w:hAnsi="Times New Roman" w:cs="Times New Roman"/>
-          <w:color w:val="000000"/>
-          <w:sz w:val="27"/>
-          <w:szCs w:val="27"/>
-        </w:rPr>
-        <w:br/>
-        <w:t>3. "Acceptance Date" means [the date for each Milestone when all Deliverables included in that Milestone have been accepted by Sponsor in accordance with the Acceptance Criteria and this Agreement.] </w:t>
+        <w:br/>
+        <w:t>2. "Acceptance Criteria" means the written technical and operational performance and functional criteria and documentation standards set out in the [project plan.</w:t>
+      </w:r>
+      <w:r>
+        <w:rPr>
+          <w:rFonts w:ascii="Times New Roman" w:eastAsia="Times New Roman" w:hAnsi="Times New Roman" w:cs="Times New Roman"/>
+          <w:color w:val="000000"/>
+          <w:sz w:val="27"/>
+          <w:szCs w:val="27"/>
+        </w:rPr>
+        <w:t>] </w:t>
+      </w:r>
+      <w:r>
+        <w:rPr>
+          <w:rFonts w:ascii="Times New Roman" w:eastAsia="Times New Roman" w:hAnsi="Times New Roman" w:cs="Times New Roman"/>
+          <w:color w:val="000000"/>
+          <w:sz w:val="27"/>
+          <w:szCs w:val="27"/>
+        </w:rPr>
+        <w:br/>
+      </w:r>
+      <w:r>
+        <w:rPr>
+          <w:rFonts w:ascii="Times New Roman" w:eastAsia="Times New Roman" w:hAnsi="Times New Roman" w:cs="Times New Roman"/>
+          <w:color w:val="000000"/>
+          <w:sz w:val="27"/>
+          <w:szCs w:val="27"/>
+        </w:rPr>
+        <w:br/>
+        <w:t xml:space="preserve">3. "Acceptance Date" means </w:t>
+      </w:r>
+      <w:bookmarkStart w:id="0" w:name="_GoBack"/>
+      <w:bookmarkEnd w:id="0"/>
+      <w:r>
+        <w:rPr>
+          <w:rFonts w:ascii="Times New Roman" w:eastAsia="Times New Roman" w:hAnsi="Times New Roman" w:cs="Times New Roman"/>
+          <w:color w:val="000000"/>
+          <w:sz w:val="27"/>
+          <w:szCs w:val="27"/>
+        </w:rPr>
+        <w:t>the date for each Milestone when all Deliverables included in that Milestone have been accepted by Sponsor in accordance with the Acceptance Criter</w:t>
+      </w:r>
+      <w:r>
+        <w:rPr>
+          <w:rFonts w:ascii="Times New Roman" w:eastAsia="Times New Roman" w:hAnsi="Times New Roman" w:cs="Times New Roman"/>
+          <w:color w:val="000000"/>
+          <w:sz w:val="27"/>
+          <w:szCs w:val="27"/>
+        </w:rPr>
+        <w:t>ia and this Agreement.</w:t>
       </w:r>
       <w:r>
         <w:rPr>
@@ -896,8 +841,16 @@
           <w:sz w:val="27"/>
           <w:szCs w:val="27"/>
         </w:rPr>
+        <w:br/>
+      </w:r>
+      <w:r>
+        <w:rPr>
+          <w:rFonts w:ascii="Times New Roman" w:eastAsia="Times New Roman" w:hAnsi="Times New Roman" w:cs="Times New Roman"/>
+          <w:color w:val="000000"/>
+          <w:sz w:val="27"/>
+          <w:szCs w:val="27"/>
+        </w:rPr>
         <w:lastRenderedPageBreak/>
-        <w:br/>
         <w:t>3.  The Senior Design instructor will act as mediary between Sponsor and Team; and resolve any conflicts that may arise.</w:t>
       </w:r>
       <w:r>
@@ -941,108 +894,43 @@
           <w:szCs w:val="27"/>
         </w:rPr>
       </w:pPr>
-      <w:r>
-        <w:rPr>
-          <w:rFonts w:ascii="Times New Roman" w:eastAsia="Times New Roman" w:hAnsi="Times New Roman" w:cs="Times New Roman"/>
-          <w:color w:val="000000"/>
-          <w:sz w:val="27"/>
-          <w:szCs w:val="27"/>
-        </w:rPr>
-        <w:t>The Sponsor agrees to confer upon</w:t>
-      </w:r>
-      <w:r>
-        <w:rPr>
-          <w:rFonts w:ascii="Times New Roman" w:eastAsia="Times New Roman" w:hAnsi="Times New Roman" w:cs="Times New Roman"/>
-          <w:color w:val="000000"/>
-          <w:sz w:val="27"/>
-          <w:szCs w:val="27"/>
-        </w:rPr>
-        <w:t xml:space="preserve"> each of</w:t>
-      </w:r>
-      <w:r>
-        <w:rPr>
-          <w:rFonts w:ascii="Times New Roman" w:eastAsia="Times New Roman" w:hAnsi="Times New Roman" w:cs="Times New Roman"/>
-          <w:color w:val="000000"/>
-          <w:sz w:val="27"/>
-          <w:szCs w:val="27"/>
-        </w:rPr>
-        <w:t xml:space="preserve"> the </w:t>
-      </w:r>
-      <w:r>
-        <w:rPr>
-          <w:rFonts w:ascii="Times New Roman" w:eastAsia="Times New Roman" w:hAnsi="Times New Roman" w:cs="Times New Roman"/>
-          <w:color w:val="000000"/>
-          <w:sz w:val="27"/>
-          <w:szCs w:val="27"/>
-        </w:rPr>
-        <w:t>Team</w:t>
-      </w:r>
-      <w:r>
-        <w:rPr>
-          <w:rFonts w:ascii="Times New Roman" w:eastAsia="Times New Roman" w:hAnsi="Times New Roman" w:cs="Times New Roman"/>
-          <w:color w:val="000000"/>
-          <w:sz w:val="27"/>
-          <w:szCs w:val="27"/>
-        </w:rPr>
-        <w:t>’s members</w:t>
-      </w:r>
-      <w:r>
-        <w:rPr>
-          <w:rFonts w:ascii="Times New Roman" w:eastAsia="Times New Roman" w:hAnsi="Times New Roman" w:cs="Times New Roman"/>
-          <w:color w:val="000000"/>
-          <w:sz w:val="27"/>
-          <w:szCs w:val="27"/>
-        </w:rPr>
-        <w:t xml:space="preserve"> the status of Intern, and pay a wage of $15 per hour.</w:t>
-      </w:r>
-    </w:p>
-    <w:p>
-      <w:pPr>
-        <w:spacing w:after="0" w:line="240" w:lineRule="auto"/>
-        <w:rPr>
-          <w:rFonts w:ascii="Times New Roman" w:eastAsia="Times New Roman" w:hAnsi="Times New Roman" w:cs="Times New Roman"/>
-          <w:color w:val="000000"/>
-          <w:sz w:val="27"/>
-          <w:szCs w:val="27"/>
-        </w:rPr>
-      </w:pPr>
-    </w:p>
-    <w:p>
-      <w:pPr>
-        <w:spacing w:after="0" w:line="240" w:lineRule="auto"/>
-        <w:rPr>
-          <w:rFonts w:ascii="Times New Roman" w:eastAsia="Times New Roman" w:hAnsi="Times New Roman" w:cs="Times New Roman"/>
-          <w:color w:val="000000"/>
-          <w:sz w:val="27"/>
-          <w:szCs w:val="27"/>
-        </w:rPr>
-      </w:pPr>
-      <w:r>
-        <w:rPr>
-          <w:rFonts w:ascii="Times New Roman" w:eastAsia="Times New Roman" w:hAnsi="Times New Roman" w:cs="Times New Roman"/>
-          <w:color w:val="000000"/>
-          <w:sz w:val="27"/>
-          <w:szCs w:val="27"/>
-        </w:rPr>
-        <w:t>The Student Group agrees to work in the Sponsor’s office for a minimum of 15 hours per week</w:t>
-      </w:r>
-      <w:r>
-        <w:rPr>
-          <w:rFonts w:ascii="Times New Roman" w:eastAsia="Times New Roman" w:hAnsi="Times New Roman" w:cs="Times New Roman"/>
-          <w:color w:val="000000"/>
-          <w:sz w:val="27"/>
-          <w:szCs w:val="27"/>
-        </w:rPr>
-        <w:t xml:space="preserve"> on the Software</w:t>
-      </w:r>
-      <w:r>
-        <w:rPr>
-          <w:rFonts w:ascii="Times New Roman" w:eastAsia="Times New Roman" w:hAnsi="Times New Roman" w:cs="Times New Roman"/>
-          <w:color w:val="000000"/>
-          <w:sz w:val="27"/>
-          <w:szCs w:val="27"/>
-        </w:rPr>
-        <w:t>.</w:t>
+    </w:p>
+    <w:p>
+      <w:pPr>
+        <w:spacing w:after="0" w:line="240" w:lineRule="auto"/>
+        <w:rPr>
+          <w:rFonts w:ascii="Times New Roman" w:eastAsia="Times New Roman" w:hAnsi="Times New Roman" w:cs="Times New Roman"/>
+          <w:color w:val="000000"/>
+          <w:sz w:val="27"/>
+          <w:szCs w:val="27"/>
+        </w:rPr>
+      </w:pPr>
+      <w:r>
+        <w:rPr>
+          <w:rFonts w:ascii="Times New Roman" w:eastAsia="Times New Roman" w:hAnsi="Times New Roman" w:cs="Times New Roman"/>
+          <w:color w:val="000000"/>
+          <w:sz w:val="27"/>
+          <w:szCs w:val="27"/>
+        </w:rPr>
+        <w:t>Each member of the Student Group will receive $15 per hour and hold an internship position</w:t>
+      </w:r>
+      <w:r>
+        <w:rPr>
+          <w:rFonts w:ascii="Times New Roman" w:eastAsia="Times New Roman" w:hAnsi="Times New Roman" w:cs="Times New Roman"/>
+          <w:color w:val="000000"/>
+          <w:sz w:val="27"/>
+          <w:szCs w:val="27"/>
+        </w:rPr>
+        <w:t xml:space="preserve"> </w:t>
+      </w:r>
+      <w:r>
+        <w:rPr>
+          <w:rFonts w:ascii="Times New Roman" w:eastAsia="Times New Roman" w:hAnsi="Times New Roman" w:cs="Times New Roman"/>
+          <w:color w:val="000000"/>
+          <w:sz w:val="27"/>
+          <w:szCs w:val="27"/>
+        </w:rPr>
+        <w:t>under the Sponsor.</w:t>
       </w:r>
     </w:p>
     <w:p>
@@ -1112,7 +1000,25 @@
           <w:szCs w:val="27"/>
         </w:rPr>
         <w:br/>
-        <w:t>1. Sponsor's designated representative for consultation and communications with the Team Lead shall be ________________________________or such other person as Sponsor may from time to time designate to the Team Lead ("Designated Representative"). </w:t>
+        <w:t>1. Sponsor's designated representative for consultation and communicatio</w:t>
+      </w:r>
+      <w:r>
+        <w:rPr>
+          <w:rFonts w:ascii="Times New Roman" w:eastAsia="Times New Roman" w:hAnsi="Times New Roman" w:cs="Times New Roman"/>
+          <w:color w:val="000000"/>
+          <w:sz w:val="27"/>
+          <w:szCs w:val="27"/>
+        </w:rPr>
+        <w:t xml:space="preserve">ns with the Team Lead shall be Brian Butterfield </w:t>
+      </w:r>
+      <w:r>
+        <w:rPr>
+          <w:rFonts w:ascii="Times New Roman" w:eastAsia="Times New Roman" w:hAnsi="Times New Roman" w:cs="Times New Roman"/>
+          <w:color w:val="000000"/>
+          <w:sz w:val="27"/>
+          <w:szCs w:val="27"/>
+        </w:rPr>
+        <w:t>or such other person as Sponsor may from time to time designate to the Team Lead ("Designated Representative"). </w:t>
       </w:r>
       <w:r>
         <w:rPr>
@@ -1239,6 +1145,87 @@
           <w:szCs w:val="27"/>
         </w:rPr>
         <w:br/>
+        <w:t xml:space="preserve">2. </w:t>
+      </w:r>
+      <w:proofErr w:type="gramStart"/>
+      <w:r>
+        <w:rPr>
+          <w:rFonts w:ascii="Times New Roman" w:eastAsia="Times New Roman" w:hAnsi="Times New Roman" w:cs="Times New Roman"/>
+          <w:color w:val="000000"/>
+          <w:sz w:val="27"/>
+          <w:szCs w:val="27"/>
+        </w:rPr>
+        <w:t>is</w:t>
+      </w:r>
+      <w:proofErr w:type="gramEnd"/>
+      <w:r>
+        <w:rPr>
+          <w:rFonts w:ascii="Times New Roman" w:eastAsia="Times New Roman" w:hAnsi="Times New Roman" w:cs="Times New Roman"/>
+          <w:color w:val="000000"/>
+          <w:sz w:val="27"/>
+          <w:szCs w:val="27"/>
+        </w:rPr>
+        <w:t xml:space="preserve"> already in the recipient party's possession at the time of disclosure thereof; </w:t>
+      </w:r>
+      <w:r>
+        <w:rPr>
+          <w:rFonts w:ascii="Times New Roman" w:eastAsia="Times New Roman" w:hAnsi="Times New Roman" w:cs="Times New Roman"/>
+          <w:color w:val="000000"/>
+          <w:sz w:val="27"/>
+          <w:szCs w:val="27"/>
+        </w:rPr>
+        <w:br/>
+        <w:t xml:space="preserve">3. </w:t>
+      </w:r>
+      <w:proofErr w:type="gramStart"/>
+      <w:r>
+        <w:rPr>
+          <w:rFonts w:ascii="Times New Roman" w:eastAsia="Times New Roman" w:hAnsi="Times New Roman" w:cs="Times New Roman"/>
+          <w:color w:val="000000"/>
+          <w:sz w:val="27"/>
+          <w:szCs w:val="27"/>
+        </w:rPr>
+        <w:t>is</w:t>
+      </w:r>
+      <w:proofErr w:type="gramEnd"/>
+      <w:r>
+        <w:rPr>
+          <w:rFonts w:ascii="Times New Roman" w:eastAsia="Times New Roman" w:hAnsi="Times New Roman" w:cs="Times New Roman"/>
+          <w:color w:val="000000"/>
+          <w:sz w:val="27"/>
+          <w:szCs w:val="27"/>
+        </w:rPr>
+        <w:t xml:space="preserve"> or later becomes part of the public domain through no fault of the recipient party; </w:t>
+      </w:r>
+      <w:r>
+        <w:rPr>
+          <w:rFonts w:ascii="Times New Roman" w:eastAsia="Times New Roman" w:hAnsi="Times New Roman" w:cs="Times New Roman"/>
+          <w:color w:val="000000"/>
+          <w:sz w:val="27"/>
+          <w:szCs w:val="27"/>
+        </w:rPr>
+        <w:br/>
+        <w:t xml:space="preserve">4. </w:t>
+      </w:r>
+      <w:proofErr w:type="gramStart"/>
+      <w:r>
+        <w:rPr>
+          <w:rFonts w:ascii="Times New Roman" w:eastAsia="Times New Roman" w:hAnsi="Times New Roman" w:cs="Times New Roman"/>
+          <w:color w:val="000000"/>
+          <w:sz w:val="27"/>
+          <w:szCs w:val="27"/>
+        </w:rPr>
+        <w:t>is</w:t>
+      </w:r>
+      <w:proofErr w:type="gramEnd"/>
+      <w:r>
+        <w:rPr>
+          <w:rFonts w:ascii="Times New Roman" w:eastAsia="Times New Roman" w:hAnsi="Times New Roman" w:cs="Times New Roman"/>
+          <w:color w:val="000000"/>
+          <w:sz w:val="27"/>
+          <w:szCs w:val="27"/>
+        </w:rPr>
+        <w:t xml:space="preserve"> received from a third party having no obligations of confidentiality to the </w:t>
       </w:r>
       <w:r>
         <w:rPr>
@@ -1248,87 +1235,7 @@
           <w:szCs w:val="27"/>
         </w:rPr>
         <w:lastRenderedPageBreak/>
-        <w:t xml:space="preserve">2. </w:t>
-      </w:r>
-      <w:proofErr w:type="gramStart"/>
-      <w:r>
-        <w:rPr>
-          <w:rFonts w:ascii="Times New Roman" w:eastAsia="Times New Roman" w:hAnsi="Times New Roman" w:cs="Times New Roman"/>
-          <w:color w:val="000000"/>
-          <w:sz w:val="27"/>
-          <w:szCs w:val="27"/>
-        </w:rPr>
-        <w:t>is</w:t>
-      </w:r>
-      <w:proofErr w:type="gramEnd"/>
-      <w:r>
-        <w:rPr>
-          <w:rFonts w:ascii="Times New Roman" w:eastAsia="Times New Roman" w:hAnsi="Times New Roman" w:cs="Times New Roman"/>
-          <w:color w:val="000000"/>
-          <w:sz w:val="27"/>
-          <w:szCs w:val="27"/>
-        </w:rPr>
-        <w:t xml:space="preserve"> already in the recipient party's possession at the time of disclosure thereof; </w:t>
-      </w:r>
-      <w:r>
-        <w:rPr>
-          <w:rFonts w:ascii="Times New Roman" w:eastAsia="Times New Roman" w:hAnsi="Times New Roman" w:cs="Times New Roman"/>
-          <w:color w:val="000000"/>
-          <w:sz w:val="27"/>
-          <w:szCs w:val="27"/>
-        </w:rPr>
-        <w:br/>
-        <w:t xml:space="preserve">3. </w:t>
-      </w:r>
-      <w:proofErr w:type="gramStart"/>
-      <w:r>
-        <w:rPr>
-          <w:rFonts w:ascii="Times New Roman" w:eastAsia="Times New Roman" w:hAnsi="Times New Roman" w:cs="Times New Roman"/>
-          <w:color w:val="000000"/>
-          <w:sz w:val="27"/>
-          <w:szCs w:val="27"/>
-        </w:rPr>
-        <w:t>is</w:t>
-      </w:r>
-      <w:proofErr w:type="gramEnd"/>
-      <w:r>
-        <w:rPr>
-          <w:rFonts w:ascii="Times New Roman" w:eastAsia="Times New Roman" w:hAnsi="Times New Roman" w:cs="Times New Roman"/>
-          <w:color w:val="000000"/>
-          <w:sz w:val="27"/>
-          <w:szCs w:val="27"/>
-        </w:rPr>
-        <w:t xml:space="preserve"> or later becomes part of the public domain through no fault of the recipient party; </w:t>
-      </w:r>
-      <w:r>
-        <w:rPr>
-          <w:rFonts w:ascii="Times New Roman" w:eastAsia="Times New Roman" w:hAnsi="Times New Roman" w:cs="Times New Roman"/>
-          <w:color w:val="000000"/>
-          <w:sz w:val="27"/>
-          <w:szCs w:val="27"/>
-        </w:rPr>
-        <w:br/>
-        <w:t xml:space="preserve">4. </w:t>
-      </w:r>
-      <w:proofErr w:type="gramStart"/>
-      <w:r>
-        <w:rPr>
-          <w:rFonts w:ascii="Times New Roman" w:eastAsia="Times New Roman" w:hAnsi="Times New Roman" w:cs="Times New Roman"/>
-          <w:color w:val="000000"/>
-          <w:sz w:val="27"/>
-          <w:szCs w:val="27"/>
-        </w:rPr>
-        <w:t>is</w:t>
-      </w:r>
-      <w:proofErr w:type="gramEnd"/>
-      <w:r>
-        <w:rPr>
-          <w:rFonts w:ascii="Times New Roman" w:eastAsia="Times New Roman" w:hAnsi="Times New Roman" w:cs="Times New Roman"/>
-          <w:color w:val="000000"/>
-          <w:sz w:val="27"/>
-          <w:szCs w:val="27"/>
-        </w:rPr>
-        <w:t xml:space="preserve"> received from a third party having no obligations of confidentiality to the disclosing party; </w:t>
+        <w:t>disclosing party; </w:t>
       </w:r>
       <w:r>
         <w:rPr>
@@ -1460,8 +1367,6 @@
         </w:rPr>
         <w:t>All deliverables become property of the Sponsor. </w:t>
       </w:r>
-      <w:bookmarkStart w:id="0" w:name="_GoBack"/>
-      <w:bookmarkEnd w:id="0"/>
     </w:p>
     <w:p>
       <w:pPr>
@@ -1695,7 +1600,16 @@
           <w:szCs w:val="27"/>
         </w:rPr>
         <w:br/>
-        <w:t xml:space="preserve">2. Sponsor shall indemnify and hold harmless the Senior Design Team, its affiliated </w:t>
+        <w:t>2. Sponsor shall indemnify and hold harmless the Senior Design Team, its affiliated companies and the officers, agents, directors and employees of the same from any and all claims and damages, losses or expenses, including attorney's fees, caused by any negligent act of Sponsor or any of Sponsor's agents, employees, subcontractors, or suppliers. </w:t>
+      </w:r>
+      <w:r>
+        <w:rPr>
+          <w:rFonts w:ascii="Times New Roman" w:eastAsia="Times New Roman" w:hAnsi="Times New Roman" w:cs="Times New Roman"/>
+          <w:color w:val="000000"/>
+          <w:sz w:val="27"/>
+          <w:szCs w:val="27"/>
+        </w:rPr>
+        <w:br/>
       </w:r>
       <w:r>
         <w:rPr>
@@ -1705,24 +1619,6 @@
           <w:szCs w:val="27"/>
         </w:rPr>
         <w:lastRenderedPageBreak/>
-        <w:t>companies and the officers, agents, directors and employees of the same from any and all claims and damages, losses or expenses, including attorney's fees, caused by any negligent act of Sponsor or any of Sponsor's agents, employees, subcontractors, or suppliers. </w:t>
-      </w:r>
-      <w:r>
-        <w:rPr>
-          <w:rFonts w:ascii="Times New Roman" w:eastAsia="Times New Roman" w:hAnsi="Times New Roman" w:cs="Times New Roman"/>
-          <w:color w:val="000000"/>
-          <w:sz w:val="27"/>
-          <w:szCs w:val="27"/>
-        </w:rPr>
-        <w:br/>
-      </w:r>
-      <w:r>
-        <w:rPr>
-          <w:rFonts w:ascii="Times New Roman" w:eastAsia="Times New Roman" w:hAnsi="Times New Roman" w:cs="Times New Roman"/>
-          <w:color w:val="000000"/>
-          <w:sz w:val="27"/>
-          <w:szCs w:val="27"/>
-        </w:rPr>
         <w:br/>
         <w:t>3. NEITHER PARTY TO THIS AGREEMENT NOR THEIR AFFILIATED COMPANIES, NOR THE OFFICERS, AGENTS, STUDENTS AND EMPLOYEES OF ANY OF THE FOREGOING, SHALL BE LIABLE TO ANY OTHER PARTY HERETO IN ANY ACTION OR CLAIM FOR CONSEQUENTIAL OR SPECIAL DAMAGES, LOSS OF PROFITS, LOSS OF OPPORTUNITY, LOSS OF PRODUCT OR LOSS OF USE, WHETHER THE ACTION IN WHICH RECOVERY OF DAMAGES IS SOUGHT IS BASED ON CONTRACT TORT (INCLUDING SOLE, CONCURRENT OR OTHER NEGLIGENCE AND STRICT LIABILITY), STATUTE OR OTHERWISE. TO THE EXTENT PERMITTED BY LAW, ANY STATUTORY REMEDIES WHICH ARE INCONSISTENT WITH THE PROVISIONS OF THESE TERMS ARE WAIVED. </w:t>
       </w:r>
@@ -1931,7 +1827,6 @@
           <w:sz w:val="27"/>
           <w:szCs w:val="27"/>
         </w:rPr>
-        <w:lastRenderedPageBreak/>
         <w:t>12. ATTACHMENTS </w:t>
       </w:r>
     </w:p>
@@ -1952,7 +1847,17 @@
           <w:szCs w:val="27"/>
         </w:rPr>
         <w:br/>
-        <w:t>Attachments A and B are incorporated and made a part of this Agreement for all purposes. </w:t>
+        <w:t xml:space="preserve">Attachments A and B are incorporated and made a part of this Agreement for all </w:t>
+      </w:r>
+      <w:r>
+        <w:rPr>
+          <w:rFonts w:ascii="Times New Roman" w:eastAsia="Times New Roman" w:hAnsi="Times New Roman" w:cs="Times New Roman"/>
+          <w:color w:val="000000"/>
+          <w:sz w:val="27"/>
+          <w:szCs w:val="27"/>
+        </w:rPr>
+        <w:lastRenderedPageBreak/>
+        <w:t>purposes. </w:t>
       </w:r>
       <w:r>
         <w:rPr>

</xml_diff>